<commit_message>
Confrontar 39 evidências e corrigir Word e figuras da Seção 1
Explicita restrições, derivações e inferências; confere Driesse e a proveniência PVDAQ. Acrescenta seis verificações de relações físicas e geração de DOCX/PDF no notebook com dez células executadas por IPython. Corrige os seis slides com fundo preto e PNGs de compatibilidade válidos, preservando os demais autores. Não repete a bibliometria nem publica PDFs integrais de terceiros.
</commit_message>
<xml_diff>
--- a/secoes/01_Recurso_Solar/producao/apresentacao/Roteiro_Oral_6_Slides.docx
+++ b/secoes/01_Recurso_Solar/producao/apresentacao/Roteiro_Oral_6_Slides.docx
@@ -66,7 +66,7 @@
           <w:rFonts w:ascii="Times New Roman" w:hAnsi="Times New Roman"/>
           <w:i w:val="0"/>
         </w:rPr>
-        <w:t xml:space="preserve">Definir a direção solar sem confundir direção com fluxo medido. O esquema é didático e não representa uma observação. θz é contado da vertical e αs da horizontal. A vista em planta define o azimute horário desde o norte. O livro Duffie usa outra origem azimutal; a convenção adotada aqui é a do SPA, também descrita no handbook. No zênite o azimute é indefinido. Fontes verificadas: B12 p. 13/PDF31; A045 cap. 2-8/PDF37.</w:t>
+        <w:t xml:space="preserve">Definir a direção solar sem confundir direção com fluxo medido. O esquema é didático e não representa uma observação. θz é contado da vertical e αs da horizontal. A vista em planta define A_s, azimute horário desde o norte. No livro Duffie, γ_s parte do sul, negativo para leste e positivo para oeste: A_s=(γ_s+180°) mod 360°. No zênite o azimute é indefinido. Fontes verificadas: B12 p. 13/PDF31; A045 cap. 2-8/PDF37.</w:t>
       </w:r>
     </w:p>
     <w:p>
@@ -402,7 +402,7 @@
           <w:rFonts w:ascii="Times New Roman" w:hAnsi="Times New Roman"/>
           <w:i w:val="0"/>
         </w:rPr>
-        <w:t xml:space="preserve">DUFFIE, John A.; BECKMAN, William A.; BLAIR, Nathan.</w:t>
+        <w:t xml:space="preserve">DELINE, Chris; PERRY, Kirsten; DECEGLIE, Michael; MULLER, Matthew; SEKULIC, William; JORDAN, Dirk.</w:t>
       </w:r>
       <w:r>
         <w:rPr>
@@ -418,14 +418,14 @@
           <w:b/>
           <w:i w:val="0"/>
         </w:rPr>
-        <w:t xml:space="preserve">Solar engineering of thermal processes, photovoltaics and wind</w:t>
-      </w:r>
-      <w:r>
-        <w:rPr>
-          <w:rFonts w:ascii="Times New Roman" w:hAnsi="Times New Roman"/>
-          <w:i w:val="0"/>
-        </w:rPr>
-        <w:t xml:space="preserve">. 5. ed. Hoboken: Wiley, 2020. ISBN 9781119540311. DOI: https://doi.org/10.1002/9781119540328.</w:t>
+        <w:t xml:space="preserve">Photovoltaic Data Acquisition (PVDAQ) Public Datasets</w:t>
+      </w:r>
+      <w:r>
+        <w:rPr>
+          <w:rFonts w:ascii="Times New Roman" w:hAnsi="Times New Roman"/>
+          <w:i w:val="0"/>
+        </w:rPr>
+        <w:t xml:space="preserve">. United States, 21 dez. 2021. Conjunto de dados. DOI: https://doi.org/10.25984/1846021.</w:t>
       </w:r>
     </w:p>
     <w:p>
@@ -441,7 +441,7 @@
           <w:rFonts w:ascii="Times New Roman" w:hAnsi="Times New Roman"/>
           <w:i w:val="0"/>
         </w:rPr>
-        <w:t xml:space="preserve">NOAA GLOBAL MONITORING LABORATORY.</w:t>
+        <w:t xml:space="preserve">DRIESSE, Anton; JENSEN, Adam R.; PEREZ, Richard. A continuous form of the Perez diffuse sky model for forward and reverse transposition.</w:t>
       </w:r>
       <w:r>
         <w:rPr>
@@ -457,14 +457,14 @@
           <w:b/>
           <w:i w:val="0"/>
         </w:rPr>
-        <w:t xml:space="preserve">General solar position calculations</w:t>
-      </w:r>
-      <w:r>
-        <w:rPr>
-          <w:rFonts w:ascii="Times New Roman" w:hAnsi="Times New Roman"/>
-          <w:i w:val="0"/>
-        </w:rPr>
-        <w:t xml:space="preserve">. [S. l.]: NOAA, [s. d.]. 2 p. Disponível em: https://gml.noaa.gov/grad/solcalc/solareqns.PDF. Acesso em: 27 out. 2026.</w:t>
+        <w:t xml:space="preserve">Solar Energy</w:t>
+      </w:r>
+      <w:r>
+        <w:rPr>
+          <w:rFonts w:ascii="Times New Roman" w:hAnsi="Times New Roman"/>
+          <w:i w:val="0"/>
+        </w:rPr>
+        <w:t xml:space="preserve">, v. 267, art. 112093, 2024. DOI: https://doi.org/10.1016/j.solener.2023.112093.</w:t>
       </w:r>
     </w:p>
     <w:p>
@@ -480,7 +480,7 @@
           <w:rFonts w:ascii="Times New Roman" w:hAnsi="Times New Roman"/>
           <w:i w:val="0"/>
         </w:rPr>
-        <w:t xml:space="preserve">PVLIB CONTRIBUTORS.</w:t>
+        <w:t xml:space="preserve">DUFFIE, John A.; BECKMAN, William A.; BLAIR, Nathan.</w:t>
       </w:r>
       <w:r>
         <w:rPr>
@@ -496,14 +496,14 @@
           <w:b/>
           <w:i w:val="0"/>
         </w:rPr>
-        <w:t xml:space="preserve">pvlib python: get_extra_radiation e spa_python</w:t>
-      </w:r>
-      <w:r>
-        <w:rPr>
-          <w:rFonts w:ascii="Times New Roman" w:hAnsi="Times New Roman"/>
-          <w:i w:val="0"/>
-        </w:rPr>
-        <w:t xml:space="preserve">. Versão 0.16.1. 2026. Disponível em: https://pvlib-python.readthedocs.io/en/v0.16.1/reference/generated/pvlib.irradiance.get_extra_radiation.html. Acesso em: 27 out. 2026.</w:t>
+        <w:t xml:space="preserve">Solar engineering of thermal processes, photovoltaics and wind</w:t>
+      </w:r>
+      <w:r>
+        <w:rPr>
+          <w:rFonts w:ascii="Times New Roman" w:hAnsi="Times New Roman"/>
+          <w:i w:val="0"/>
+        </w:rPr>
+        <w:t xml:space="preserve">. 5. ed. Hoboken: Wiley, 2020. ISBN 9781119540311. DOI: https://doi.org/10.1002/9781119540328.</w:t>
       </w:r>
     </w:p>
     <w:p>
@@ -519,7 +519,7 @@
           <w:rFonts w:ascii="Times New Roman" w:hAnsi="Times New Roman"/>
           <w:i w:val="0"/>
         </w:rPr>
-        <w:t xml:space="preserve">REDA, Ibrahim; ANDREAS, Afshin. Solar position algorithm for solar radiation applications.</w:t>
+        <w:t xml:space="preserve">NOAA GLOBAL MONITORING LABORATORY.</w:t>
       </w:r>
       <w:r>
         <w:rPr>
@@ -535,14 +535,14 @@
           <w:b/>
           <w:i w:val="0"/>
         </w:rPr>
-        <w:t xml:space="preserve">Solar Energy</w:t>
-      </w:r>
-      <w:r>
-        <w:rPr>
-          <w:rFonts w:ascii="Times New Roman" w:hAnsi="Times New Roman"/>
-          <w:i w:val="0"/>
-        </w:rPr>
-        <w:t xml:space="preserve">, v. 76, n. 5, p. 577–589, 2004. DOI: https://doi.org/10.1016/j.solener.2003.12.003.</w:t>
+        <w:t xml:space="preserve">General solar position calculations</w:t>
+      </w:r>
+      <w:r>
+        <w:rPr>
+          <w:rFonts w:ascii="Times New Roman" w:hAnsi="Times New Roman"/>
+          <w:i w:val="0"/>
+        </w:rPr>
+        <w:t xml:space="preserve">. [S. l.]: NOAA, [s. d.]. 2 p. Disponível em: https://gml.noaa.gov/grad/solcalc/solareqns.PDF. Acesso em: 27 out. 2026.</w:t>
       </w:r>
     </w:p>
     <w:p>
@@ -558,7 +558,7 @@
           <w:rFonts w:ascii="Times New Roman" w:hAnsi="Times New Roman"/>
           <w:i w:val="0"/>
         </w:rPr>
-        <w:t xml:space="preserve">REDA, Ibrahim; ANDREAS, Afshin.</w:t>
+        <w:t xml:space="preserve">PVLIB CONTRIBUTORS.</w:t>
       </w:r>
       <w:r>
         <w:rPr>
@@ -574,14 +574,14 @@
           <w:b/>
           <w:i w:val="0"/>
         </w:rPr>
-        <w:t xml:space="preserve">Solar position algorithm for solar radiation applications</w:t>
-      </w:r>
-      <w:r>
-        <w:rPr>
-          <w:rFonts w:ascii="Times New Roman" w:hAnsi="Times New Roman"/>
-          <w:i w:val="0"/>
-        </w:rPr>
-        <w:t xml:space="preserve">. Revised January 2008. Golden: National Renewable Energy Laboratory, 2008. Relatório NREL/TP-560-34302. DOI: https://doi.org/10.2172/15003974.</w:t>
+        <w:t xml:space="preserve">pvlib python: get_extra_radiation e spa_python</w:t>
+      </w:r>
+      <w:r>
+        <w:rPr>
+          <w:rFonts w:ascii="Times New Roman" w:hAnsi="Times New Roman"/>
+          <w:i w:val="0"/>
+        </w:rPr>
+        <w:t xml:space="preserve">. Versão 0.16.1. 2026. Disponível em: https://pvlib-python.readthedocs.io/en/v0.16.1/reference/generated/pvlib.irradiance.get_extra_radiation.html. Acesso em: 27 out. 2026.</w:t>
       </w:r>
     </w:p>
     <w:p>
@@ -597,6 +597,84 @@
           <w:rFonts w:ascii="Times New Roman" w:hAnsi="Times New Roman"/>
           <w:i w:val="0"/>
         </w:rPr>
+        <w:t xml:space="preserve">REDA, Ibrahim; ANDREAS, Afshin. Solar position algorithm for solar radiation applications.</w:t>
+      </w:r>
+      <w:r>
+        <w:rPr>
+          <w:rFonts w:ascii="Times New Roman" w:hAnsi="Times New Roman"/>
+          <w:i w:val="0"/>
+        </w:rPr>
+        <w:t xml:space="preserve"> </w:t>
+      </w:r>
+      <w:r>
+        <w:rPr>
+          <w:bCs/>
+          <w:rFonts w:ascii="Times New Roman" w:hAnsi="Times New Roman"/>
+          <w:b/>
+          <w:i w:val="0"/>
+        </w:rPr>
+        <w:t xml:space="preserve">Solar Energy</w:t>
+      </w:r>
+      <w:r>
+        <w:rPr>
+          <w:rFonts w:ascii="Times New Roman" w:hAnsi="Times New Roman"/>
+          <w:i w:val="0"/>
+        </w:rPr>
+        <w:t xml:space="preserve">, v. 76, n. 5, p. 577–589, 2004. DOI: https://doi.org/10.1016/j.solener.2003.12.003.</w:t>
+      </w:r>
+    </w:p>
+    <w:p>
+      <w:pPr>
+        <w:pStyle w:val="BodyText"/>
+        <w:widowControl/>
+        <w:spacing w:line="264" w:lineRule="auto"/>
+        <w:ind w:hanging="340" w:left="340"/>
+        <w:jc w:val="left"/>
+      </w:pPr>
+      <w:r>
+        <w:rPr>
+          <w:rFonts w:ascii="Times New Roman" w:hAnsi="Times New Roman"/>
+          <w:i w:val="0"/>
+        </w:rPr>
+        <w:t xml:space="preserve">REDA, Ibrahim; ANDREAS, Afshin.</w:t>
+      </w:r>
+      <w:r>
+        <w:rPr>
+          <w:rFonts w:ascii="Times New Roman" w:hAnsi="Times New Roman"/>
+          <w:i w:val="0"/>
+        </w:rPr>
+        <w:t xml:space="preserve"> </w:t>
+      </w:r>
+      <w:r>
+        <w:rPr>
+          <w:bCs/>
+          <w:rFonts w:ascii="Times New Roman" w:hAnsi="Times New Roman"/>
+          <w:b/>
+          <w:i w:val="0"/>
+        </w:rPr>
+        <w:t xml:space="preserve">Solar position algorithm for solar radiation applications</w:t>
+      </w:r>
+      <w:r>
+        <w:rPr>
+          <w:rFonts w:ascii="Times New Roman" w:hAnsi="Times New Roman"/>
+          <w:i w:val="0"/>
+        </w:rPr>
+        <w:t xml:space="preserve">. Revised January 2008. Golden: National Renewable Energy Laboratory, 2008. Relatório NREL/TP-560-34302. DOI: https://doi.org/10.2172/15003974.</w:t>
+      </w:r>
+    </w:p>
+    <w:p>
+      <w:pPr>
+        <w:pStyle w:val="BodyText"/>
+        <w:widowControl/>
+        <w:spacing w:line="264" w:lineRule="auto"/>
+        <w:ind w:hanging="340" w:left="340"/>
+        <w:jc w:val="left"/>
+      </w:pPr>
+      <w:r>
+        <w:rPr>
+          <w:rFonts w:ascii="Times New Roman" w:hAnsi="Times New Roman"/>
+          <w:i w:val="0"/>
+        </w:rPr>
         <w:t xml:space="preserve">SENGUPTA, Manajit et al. (ed.).</w:t>
       </w:r>
       <w:r>
@@ -620,7 +698,7 @@
           <w:rFonts w:ascii="Times New Roman" w:hAnsi="Times New Roman"/>
           <w:i w:val="0"/>
         </w:rPr>
-        <w:t xml:space="preserve">. 4. ed. Golden: National Renewable Energy Laboratory, 2024. Relatório NREL/TP-5D00-88300. Disponível em: https://docs.nrel.gov/docs/fy24osti/88300.pdf. Acesso em: 27 out. 2026.</w:t>
+        <w:t xml:space="preserve">. 4. ed. Golden: National Renewable Energy Laboratory, 2024. Relatório NREL/TP-5D00-88300. DOI: https://doi.org/10.2172/2448063. Disponível em: https://docs.nrel.gov/docs/fy24osti/88300.pdf. Acesso em: 27 out. 2026.</w:t>
       </w:r>
     </w:p>
     <w:p>

</xml_diff>